<commit_message>
AGGIORNATO PROC. MIGRAZIONE 5-3-20
</commit_message>
<xml_diff>
--- a/docs/ProceduraDiMigrazione/Procedura_migrazione_25022020.docx
+++ b/docs/ProceduraDiMigrazione/Procedura_migrazione_25022020.docx
@@ -1161,57 +1161,33 @@
     <w:p>
       <w:pPr>
         <w:pStyle w:val="Paragrafoelenco"/>
-        <w:numPr>
-          <w:ilvl w:val="0"/>
-          <w:numId w:val="2"/>
-        </w:numPr>
-      </w:pPr>
-      <w:r>
-        <w:t xml:space="preserve">[FATTO DA </w:t>
-      </w:r>
-      <w:r>
-        <w:t>SILVIO</w:t>
-      </w:r>
-      <w:r>
-        <w:t xml:space="preserve">] </w:t>
-      </w:r>
-      <w:r>
-        <w:t xml:space="preserve">Copiare la </w:t>
-      </w:r>
-      <w:proofErr w:type="spellStart"/>
-      <w:r>
-        <w:t>view</w:t>
-      </w:r>
-      <w:proofErr w:type="spellEnd"/>
-      <w:r>
-        <w:t xml:space="preserve"> “</w:t>
-      </w:r>
-      <w:proofErr w:type="spellStart"/>
-      <w:r>
-        <w:t>grc_lista_funzioni</w:t>
-      </w:r>
-      <w:proofErr w:type="spellEnd"/>
-      <w:r>
-        <w:t xml:space="preserve">” (e query collegate … </w:t>
-      </w:r>
-      <w:r>
-        <w:rPr>
-          <w:highlight w:val="yellow"/>
-        </w:rPr>
-        <w:t>determinare quali sono</w:t>
-      </w:r>
-      <w:r>
-        <w:sym w:font="Wingdings" w:char="F0E0"/>
-      </w:r>
-      <w:r>
-        <w:rPr>
-          <w:highlight w:val="magenta"/>
-        </w:rPr>
-        <w:t>?</w:t>
-      </w:r>
-      <w:r>
-        <w:t>) su DB3 per ottenere una lista delle funzioni presenti in DB3.</w:t>
-      </w:r>
+        <w:ind w:left="360"/>
+      </w:pPr>
+    </w:p>
+    <w:p>
+      <w:pPr>
+        <w:pStyle w:val="Paragrafoelenco"/>
+        <w:ind w:left="360"/>
+        <w:rPr>
+          <w:b/>
+          <w:bCs/>
+          <w:u w:val="single"/>
+        </w:rPr>
+      </w:pPr>
+      <w:r>
+        <w:rPr>
+          <w:b/>
+          <w:bCs/>
+          <w:u w:val="single"/>
+        </w:rPr>
+        <w:t>FUNZIONI</w:t>
+      </w:r>
+    </w:p>
+    <w:p>
+      <w:pPr>
+        <w:pStyle w:val="Paragrafoelenco"/>
+        <w:ind w:left="360"/>
+      </w:pPr>
     </w:p>
     <w:p>
       <w:pPr>
@@ -1225,6 +1201,61 @@
         <w:t xml:space="preserve">[FATTO DA SILVIO] </w:t>
       </w:r>
       <w:r>
+        <w:t xml:space="preserve">Copiare la </w:t>
+      </w:r>
+      <w:proofErr w:type="spellStart"/>
+      <w:r>
+        <w:t>view</w:t>
+      </w:r>
+      <w:proofErr w:type="spellEnd"/>
+      <w:r>
+        <w:t xml:space="preserve"> “</w:t>
+      </w:r>
+      <w:proofErr w:type="spellStart"/>
+      <w:r>
+        <w:t>grc_lista_funzioni</w:t>
+      </w:r>
+      <w:proofErr w:type="spellEnd"/>
+      <w:r>
+        <w:t xml:space="preserve">” (e query collegate … </w:t>
+      </w:r>
+      <w:r>
+        <w:rPr>
+          <w:highlight w:val="yellow"/>
+        </w:rPr>
+        <w:t>determinare quali sono</w:t>
+      </w:r>
+      <w:r>
+        <w:sym w:font="Wingdings" w:char="F0E0"/>
+      </w:r>
+      <w:r>
+        <w:rPr>
+          <w:highlight w:val="magenta"/>
+        </w:rPr>
+        <w:t>?</w:t>
+      </w:r>
+      <w:r>
+        <w:t>) su DB3 per ottenere una lista delle funzioni presenti in DB3.</w:t>
+      </w:r>
+    </w:p>
+    <w:p>
+      <w:pPr>
+        <w:pStyle w:val="Paragrafoelenco"/>
+        <w:numPr>
+          <w:ilvl w:val="0"/>
+          <w:numId w:val="16"/>
+        </w:numPr>
+        <w:spacing w:after="160" w:line="259" w:lineRule="auto"/>
+        <w:rPr>
+          <w:b/>
+          <w:bCs/>
+          <w:color w:val="000000" w:themeColor="text1"/>
+        </w:rPr>
+      </w:pPr>
+      <w:r>
+        <w:t xml:space="preserve">[FATTO DA SILVIO] </w:t>
+      </w:r>
+      <w:r>
         <w:t xml:space="preserve">Usare la </w:t>
       </w:r>
       <w:proofErr w:type="spellStart"/>
@@ -1263,10 +1294,7 @@
       </w:r>
       <w:proofErr w:type="spellEnd"/>
       <w:r>
-        <w:t xml:space="preserve"> restituisce una colonna con tutti i nomi delle funzioni all’interno del DB</w:t>
-      </w:r>
-      <w:r>
-        <w:t xml:space="preserve">2. Copiare tale colonna e incollarla nel file </w:t>
+        <w:t xml:space="preserve"> restituisce una colonna con tutti i nomi delle funzioni all’interno del DB2. Copiare tale colonna e incollarla nel file </w:t>
       </w:r>
       <w:proofErr w:type="spellStart"/>
       <w:r>
@@ -1299,8 +1327,143 @@
         <w:rPr>
           <w:b/>
           <w:bCs/>
+          <w:color w:val="000000" w:themeColor="text1"/>
+        </w:rPr>
+        <w:t xml:space="preserve">LISTA </w:t>
+      </w:r>
+      <w:r>
+        <w:rPr>
+          <w:b/>
+          <w:bCs/>
+          <w:color w:val="000000" w:themeColor="text1"/>
+        </w:rPr>
+        <w:t xml:space="preserve">FUNZIONI </w:t>
+      </w:r>
+      <w:r>
+        <w:rPr>
+          <w:b/>
+          <w:bCs/>
+          <w:color w:val="000000" w:themeColor="text1"/>
         </w:rPr>
         <w:t>GORICO</w:t>
+      </w:r>
+      <w:r>
+        <w:rPr>
+          <w:b/>
+          <w:bCs/>
+          <w:color w:val="000000" w:themeColor="text1"/>
+        </w:rPr>
+        <w:t xml:space="preserve"> (DB2)”</w:t>
+      </w:r>
+    </w:p>
+    <w:p>
+      <w:pPr>
+        <w:pStyle w:val="Paragrafoelenco"/>
+        <w:numPr>
+          <w:ilvl w:val="0"/>
+          <w:numId w:val="16"/>
+        </w:numPr>
+        <w:spacing w:after="160" w:line="259" w:lineRule="auto"/>
+        <w:rPr>
+          <w:b/>
+          <w:bCs/>
+          <w:color w:val="000000" w:themeColor="text1"/>
+        </w:rPr>
+      </w:pPr>
+      <w:r>
+        <w:t xml:space="preserve">[FATTO DA SILVIO] </w:t>
+      </w:r>
+      <w:r>
+        <w:t xml:space="preserve">Usare la </w:t>
+      </w:r>
+      <w:proofErr w:type="spellStart"/>
+      <w:r>
+        <w:t>view</w:t>
+      </w:r>
+      <w:proofErr w:type="spellEnd"/>
+      <w:r>
+        <w:t xml:space="preserve"> </w:t>
+      </w:r>
+      <w:proofErr w:type="spellStart"/>
+      <w:r>
+        <w:t>grc_lista_funzioni</w:t>
+      </w:r>
+      <w:proofErr w:type="spellEnd"/>
+      <w:r>
+        <w:t xml:space="preserve"> per ottenere una lista delle funzioni presenti nel database3.</w:t>
+      </w:r>
+      <w:r>
+        <w:t xml:space="preserve"> </w:t>
+      </w:r>
+      <w:r>
+        <w:t xml:space="preserve">Tale </w:t>
+      </w:r>
+      <w:proofErr w:type="spellStart"/>
+      <w:r>
+        <w:t>view</w:t>
+      </w:r>
+      <w:proofErr w:type="spellEnd"/>
+      <w:r>
+        <w:t xml:space="preserve"> restituisce una colonna con tutti i nomi delle funzioni all’interno del DB3. Copiare tale colonna e incollarla nel file </w:t>
+      </w:r>
+      <w:proofErr w:type="spellStart"/>
+      <w:r>
+        <w:t>excel</w:t>
+      </w:r>
+      <w:proofErr w:type="spellEnd"/>
+      <w:r>
+        <w:t>: “</w:t>
+      </w:r>
+      <w:proofErr w:type="spellStart"/>
+      <w:r>
+        <w:t>funzioni_e_view_gorico_goricoprod</w:t>
+      </w:r>
+      <w:proofErr w:type="spellEnd"/>
+      <w:r>
+        <w:t>” foglio 1</w:t>
+      </w:r>
+      <w:r>
+        <w:t xml:space="preserve"> e nel file word “</w:t>
+      </w:r>
+      <w:proofErr w:type="spellStart"/>
+      <w:r>
+        <w:t>funzioni_gorico_goricoprod</w:t>
+      </w:r>
+      <w:proofErr w:type="spellEnd"/>
+      <w:r>
+        <w:t>”, secondo capitolo “</w:t>
+      </w:r>
+      <w:r>
+        <w:rPr>
+          <w:b/>
+          <w:bCs/>
+          <w:color w:val="000000" w:themeColor="text1"/>
+        </w:rPr>
+        <w:t>LISTA</w:t>
+      </w:r>
+      <w:r>
+        <w:rPr>
+          <w:b/>
+          <w:bCs/>
+          <w:color w:val="000000" w:themeColor="text1"/>
+        </w:rPr>
+        <w:t xml:space="preserve"> FUNZIONI</w:t>
+      </w:r>
+      <w:r>
+        <w:rPr>
+          <w:b/>
+          <w:bCs/>
+          <w:color w:val="000000" w:themeColor="text1"/>
+        </w:rPr>
+        <w:t xml:space="preserve"> GORICOPROD</w:t>
+      </w:r>
+      <w:r>
+        <w:rPr>
+          <w:b/>
+          <w:bCs/>
+          <w:color w:val="000000" w:themeColor="text1"/>
+        </w:rPr>
+        <w:t xml:space="preserve"> (DB3)</w:t>
       </w:r>
       <w:r>
         <w:t>”</w:t>
@@ -1313,57 +1476,134 @@
           <w:ilvl w:val="0"/>
           <w:numId w:val="2"/>
         </w:numPr>
+        <w:rPr>
+          <w:b/>
+          <w:bCs/>
+        </w:rPr>
       </w:pPr>
       <w:r>
         <w:t xml:space="preserve">[FATTO DA SILVIO] </w:t>
       </w:r>
       <w:r>
-        <w:t xml:space="preserve">Usare la </w:t>
-      </w:r>
-      <w:proofErr w:type="spellStart"/>
-      <w:r>
-        <w:t>view</w:t>
-      </w:r>
-      <w:proofErr w:type="spellEnd"/>
+        <w:t xml:space="preserve">Determinare quali funzioni </w:t>
+      </w:r>
+      <w:r>
+        <w:t xml:space="preserve">ci sono in DB2 e che </w:t>
+      </w:r>
+      <w:r>
+        <w:t>mancano in DB3</w:t>
+      </w:r>
+      <w:r>
+        <w:t xml:space="preserve"> utilizzando la funzione </w:t>
+      </w:r>
+      <w:proofErr w:type="spellStart"/>
+      <w:proofErr w:type="gramStart"/>
+      <w:r>
+        <w:t>cerca.vert</w:t>
+      </w:r>
+      <w:proofErr w:type="spellEnd"/>
+      <w:proofErr w:type="gramEnd"/>
+      <w:r>
+        <w:t xml:space="preserve"> nel file </w:t>
+      </w:r>
+      <w:proofErr w:type="spellStart"/>
+      <w:r>
+        <w:t>excel</w:t>
+      </w:r>
+      <w:proofErr w:type="spellEnd"/>
+      <w:r>
+        <w:t xml:space="preserve"> “</w:t>
+      </w:r>
+      <w:proofErr w:type="spellStart"/>
+      <w:r>
+        <w:t>funzioni_e_view_gorico_goricoprod</w:t>
+      </w:r>
+      <w:proofErr w:type="spellEnd"/>
+      <w:r>
+        <w:t>” foglio 1</w:t>
+      </w:r>
+      <w:r>
+        <w:t>.</w:t>
+      </w:r>
+      <w:r>
+        <w:t xml:space="preserve"> La funzione restituisce gli elementi </w:t>
+      </w:r>
+      <w:r>
+        <w:rPr>
+          <w:u w:val="single"/>
+        </w:rPr>
+        <w:t>COMUNI</w:t>
+      </w:r>
+      <w:r>
+        <w:rPr>
+          <w:u w:val="single"/>
+        </w:rPr>
+        <w:t xml:space="preserve"> (DB2 n DB</w:t>
+      </w:r>
+      <w:proofErr w:type="gramStart"/>
+      <w:r>
+        <w:rPr>
+          <w:u w:val="single"/>
+        </w:rPr>
+        <w:t>3 ,</w:t>
+      </w:r>
+      <w:proofErr w:type="gramEnd"/>
+      <w:r>
+        <w:rPr>
+          <w:u w:val="single"/>
+        </w:rPr>
+        <w:t xml:space="preserve"> dove “n” significa “intersecato”)</w:t>
+      </w:r>
+      <w:r>
+        <w:t xml:space="preserve">. Affiancare quindi le colonne di DB2 a quelle di DB2nDB3 per “sottrarre” le 2 colonne, in modo da avere un’ulteriore colonna con la lista delle funzioni che sono in DB2 ma che non sono in DB3, che sono esattamente le funzioni che dobbiamo importare. </w:t>
+      </w:r>
+      <w:r>
+        <w:t>Una volta ottenuta tale lista, scriverla nel file word “</w:t>
+      </w:r>
+      <w:proofErr w:type="spellStart"/>
+      <w:r>
+        <w:t>funzioni_gorico_goricoprod</w:t>
+      </w:r>
+      <w:proofErr w:type="spellEnd"/>
+      <w:proofErr w:type="gramStart"/>
+      <w:r>
+        <w:t xml:space="preserve">” </w:t>
+      </w:r>
+      <w:r>
+        <w:t>,</w:t>
+      </w:r>
+      <w:r>
+        <w:t>terzo</w:t>
+      </w:r>
+      <w:proofErr w:type="gramEnd"/>
+      <w:r>
+        <w:t xml:space="preserve"> capitolo</w:t>
+      </w:r>
+      <w:r>
+        <w:t xml:space="preserve"> “</w:t>
+      </w:r>
+      <w:r>
+        <w:rPr>
+          <w:b/>
+          <w:bCs/>
+        </w:rPr>
+        <w:t>LISTA</w:t>
+      </w:r>
       <w:r>
         <w:t xml:space="preserve"> </w:t>
       </w:r>
-      <w:proofErr w:type="spellStart"/>
-      <w:r>
-        <w:t>grc_lista_funzioni</w:t>
-      </w:r>
-      <w:proofErr w:type="spellEnd"/>
-      <w:r>
-        <w:t xml:space="preserve"> per </w:t>
-      </w:r>
-      <w:r>
-        <w:t>ottenere una lista delle funzioni presenti nel database</w:t>
-      </w:r>
-      <w:r>
-        <w:t>3</w:t>
-      </w:r>
-      <w:r>
-        <w:t>.</w:t>
-      </w:r>
-      <w:r>
-        <w:t xml:space="preserve"> </w:t>
-      </w:r>
-      <w:r>
-        <w:t xml:space="preserve">Tale </w:t>
-      </w:r>
-      <w:proofErr w:type="spellStart"/>
-      <w:r>
-        <w:t>view</w:t>
-      </w:r>
-      <w:proofErr w:type="spellEnd"/>
-      <w:r>
-        <w:t xml:space="preserve"> restituisce una colonna con tutti i nomi delle funzioni all’interno del DB</w:t>
-      </w:r>
-      <w:r>
-        <w:t>3</w:t>
-      </w:r>
-      <w:r>
-        <w:t xml:space="preserve">. Copiare tale colonna e incollarla nel file </w:t>
+      <w:r>
+        <w:rPr>
+          <w:b/>
+          <w:bCs/>
+        </w:rPr>
+        <w:t>FUNZIONI IN DB2 CHE NON CI SONO IN DB3 (DB2-DB3)</w:t>
+      </w:r>
+      <w:r>
+        <w:t>”.</w:t>
+      </w:r>
+      <w:r>
+        <w:t xml:space="preserve"> Inoltre, salvare tale colonna in un file </w:t>
       </w:r>
       <w:proofErr w:type="spellStart"/>
       <w:r>
@@ -1371,55 +1611,15 @@
       </w:r>
       <w:proofErr w:type="spellEnd"/>
       <w:r>
-        <w:t>: “</w:t>
-      </w:r>
-      <w:proofErr w:type="spellStart"/>
-      <w:r>
-        <w:t>funzioni_e_view_gorico_goricoprod</w:t>
-      </w:r>
-      <w:proofErr w:type="spellEnd"/>
-      <w:r>
-        <w:t>”</w:t>
-      </w:r>
-      <w:r>
-        <w:t xml:space="preserve"> foglio 1</w:t>
-      </w:r>
-      <w:r>
-        <w:t xml:space="preserve"> </w:t>
-      </w:r>
-      <w:r>
-        <w:t>e nel file word “</w:t>
-      </w:r>
-      <w:proofErr w:type="spellStart"/>
-      <w:r>
-        <w:t>funzioni_gorico_goricoprod</w:t>
-      </w:r>
-      <w:proofErr w:type="spellEnd"/>
-      <w:r>
-        <w:t xml:space="preserve">”, </w:t>
-      </w:r>
-      <w:r>
-        <w:t>secondo</w:t>
-      </w:r>
-      <w:r>
-        <w:t xml:space="preserve"> capitolo “</w:t>
-      </w:r>
-      <w:r>
-        <w:rPr>
-          <w:b/>
-          <w:bCs/>
-        </w:rPr>
-        <w:t>GORICO</w:t>
-      </w:r>
-      <w:r>
-        <w:rPr>
-          <w:b/>
-          <w:bCs/>
-        </w:rPr>
-        <w:t>PROD</w:t>
-      </w:r>
-      <w:r>
-        <w:t>”</w:t>
+        <w:t xml:space="preserve"> a parte che può essere chiamato, ad esempio, “da_importare.csv”. Il file dev’essere salvato in formato </w:t>
+      </w:r>
+      <w:proofErr w:type="spellStart"/>
+      <w:r>
+        <w:t>csv</w:t>
+      </w:r>
+      <w:proofErr w:type="spellEnd"/>
+      <w:r>
+        <w:t xml:space="preserve"> con codifica UTF8 (scegliere nel menù a tendina quando salvi il dato”.</w:t>
       </w:r>
     </w:p>
     <w:p>
@@ -1438,86 +1638,105 @@
         <w:t xml:space="preserve">[FATTO DA SILVIO] </w:t>
       </w:r>
       <w:r>
-        <w:t xml:space="preserve">Determinare quali funzioni </w:t>
-      </w:r>
-      <w:r>
-        <w:t xml:space="preserve">ci sono in DB2 e che </w:t>
-      </w:r>
-      <w:r>
-        <w:t>mancano in DB3</w:t>
-      </w:r>
-      <w:r>
-        <w:t xml:space="preserve"> utilizzando la funzione </w:t>
-      </w:r>
-      <w:proofErr w:type="spellStart"/>
-      <w:proofErr w:type="gramStart"/>
-      <w:r>
-        <w:t>cerca.vert</w:t>
-      </w:r>
-      <w:proofErr w:type="spellEnd"/>
-      <w:proofErr w:type="gramEnd"/>
-      <w:r>
-        <w:t xml:space="preserve"> nel file </w:t>
-      </w:r>
-      <w:proofErr w:type="spellStart"/>
-      <w:r>
-        <w:t>excel</w:t>
+        <w:t>Copiare da DB2 l’SQL della tabella “</w:t>
+      </w:r>
+      <w:proofErr w:type="spellStart"/>
+      <w:r>
+        <w:t>funzioni_da_importare</w:t>
+      </w:r>
+      <w:proofErr w:type="spellEnd"/>
+      <w:r>
+        <w:t>” in DB3 per creare la tabella. Riempire la suddetta tabella: tasto destro</w:t>
+      </w:r>
+      <w:r>
+        <w:sym w:font="Wingdings" w:char="F0E0"/>
+      </w:r>
+      <w:r>
+        <w:t>import-export</w:t>
+      </w:r>
+      <w:r>
+        <w:sym w:font="Wingdings" w:char="F0E0"/>
+      </w:r>
+      <w:r>
+        <w:rPr>
+          <w:u w:val="single"/>
+        </w:rPr>
+        <w:t>import</w:t>
+      </w:r>
+      <w:r>
+        <w:t xml:space="preserve"> (slider in alto)</w:t>
+      </w:r>
+      <w:r>
+        <w:sym w:font="Wingdings" w:char="F0E0"/>
+      </w:r>
+      <w:r>
+        <w:t xml:space="preserve"> selezionare il file </w:t>
+      </w:r>
+      <w:proofErr w:type="spellStart"/>
+      <w:r>
+        <w:t>csv</w:t>
       </w:r>
       <w:proofErr w:type="spellEnd"/>
       <w:r>
         <w:t xml:space="preserve"> </w:t>
       </w:r>
       <w:r>
-        <w:t>“</w:t>
-      </w:r>
-      <w:proofErr w:type="spellStart"/>
-      <w:r>
-        <w:t>funzioni_e_view_gorico_goricoprod</w:t>
-      </w:r>
-      <w:proofErr w:type="spellEnd"/>
-      <w:r>
-        <w:t>” foglio</w:t>
-      </w:r>
-      <w:r>
-        <w:t xml:space="preserve"> 1</w:t>
-      </w:r>
-      <w:r>
-        <w:t>.</w:t>
-      </w:r>
-      <w:r>
-        <w:t xml:space="preserve"> Una volta ottenuta tale lista, scriverla nel file word “</w:t>
-      </w:r>
-      <w:proofErr w:type="spellStart"/>
-      <w:r>
-        <w:t>funzioni_gorico_goricoprod</w:t>
-      </w:r>
-      <w:proofErr w:type="spellEnd"/>
-      <w:proofErr w:type="gramStart"/>
-      <w:r>
-        <w:t xml:space="preserve">” </w:t>
-      </w:r>
-      <w:r>
-        <w:t>,</w:t>
-      </w:r>
-      <w:r>
-        <w:t>terzo</w:t>
-      </w:r>
-      <w:proofErr w:type="gramEnd"/>
-      <w:r>
-        <w:t xml:space="preserve"> capitolo</w:t>
-      </w:r>
-      <w:r>
-        <w:t xml:space="preserve"> “</w:t>
-      </w:r>
-      <w:r>
-        <w:rPr>
-          <w:b/>
-          <w:bCs/>
-        </w:rPr>
-        <w:t>FUNZIONI IN DB2 CHE NON CI SONO IN DB3 (DB2-DB3)</w:t>
-      </w:r>
-      <w:r>
-        <w:t>”.</w:t>
+        <w:t>“da_importare.csv</w:t>
+      </w:r>
+      <w:r>
+        <w:t xml:space="preserve">” appena salvato (dev’essere chiuso per poter eseguire la procedura, altrimenti </w:t>
+      </w:r>
+      <w:proofErr w:type="spellStart"/>
+      <w:r>
+        <w:t>pgadmin</w:t>
+      </w:r>
+      <w:proofErr w:type="spellEnd"/>
+      <w:r>
+        <w:t xml:space="preserve"> ti dà permesso negato”)</w:t>
+      </w:r>
+      <w:r>
+        <w:sym w:font="Wingdings" w:char="F0E0"/>
+      </w:r>
+      <w:r>
+        <w:t xml:space="preserve">format: </w:t>
+      </w:r>
+      <w:proofErr w:type="spellStart"/>
+      <w:r>
+        <w:t>csv</w:t>
+      </w:r>
+      <w:proofErr w:type="spellEnd"/>
+      <w:r>
+        <w:t xml:space="preserve">; </w:t>
+      </w:r>
+      <w:proofErr w:type="spellStart"/>
+      <w:r>
+        <w:t>encoding</w:t>
+      </w:r>
+      <w:proofErr w:type="spellEnd"/>
+      <w:r>
+        <w:t xml:space="preserve">: UTF 8; OID: no; </w:t>
+      </w:r>
+      <w:proofErr w:type="spellStart"/>
+      <w:r>
+        <w:t>Header</w:t>
+      </w:r>
+      <w:proofErr w:type="spellEnd"/>
+      <w:r>
+        <w:t xml:space="preserve">: yes; </w:t>
+      </w:r>
+      <w:proofErr w:type="spellStart"/>
+      <w:r>
+        <w:t>delimiter</w:t>
+      </w:r>
+      <w:proofErr w:type="spellEnd"/>
+      <w:r>
+        <w:t xml:space="preserve">: “;” </w:t>
+      </w:r>
+      <w:r>
+        <w:sym w:font="Wingdings" w:char="F0E0"/>
+      </w:r>
+      <w:r>
+        <w:t>ok.</w:t>
       </w:r>
     </w:p>
     <w:p>
@@ -1542,10 +1761,7 @@
         </w:numPr>
       </w:pPr>
       <w:r>
-        <w:t xml:space="preserve">[FATTO DA SILVIO] </w:t>
-      </w:r>
-      <w:r>
-        <w:t>U</w:t>
+        <w:t>[FATTO DA SILVIO] U</w:t>
       </w:r>
       <w:r>
         <w:t>tilizzare la</w:t>
@@ -1623,10 +1839,28 @@
           <w:b/>
           <w:bCs/>
         </w:rPr>
+        <w:t xml:space="preserve">DEFINIZIONI </w:t>
+      </w:r>
+      <w:r>
+        <w:rPr>
+          <w:b/>
+          <w:bCs/>
+        </w:rPr>
         <w:t>FUNZIONI DI GORICO</w:t>
       </w:r>
       <w:r>
-        <w:t>”. Per completezza eseguire lo stesso identico procedimento e copia incollare la lista delle definizioni delle funzioni anche per db3 sotto al capitolo 5 “</w:t>
+        <w:t xml:space="preserve">”. Per completezza eseguire lo stesso identico </w:t>
+      </w:r>
+      <w:r>
+        <w:lastRenderedPageBreak/>
+        <w:t>procedimento e copia incollare la lista delle definizioni delle funzioni anche per db3 sotto al capitolo 5 “</w:t>
+      </w:r>
+      <w:r>
+        <w:rPr>
+          <w:b/>
+          <w:bCs/>
+        </w:rPr>
+        <w:t xml:space="preserve">DEFINIZIONI </w:t>
       </w:r>
       <w:r>
         <w:rPr>
@@ -1642,28 +1876,98 @@
         </w:rPr>
         <w:t xml:space="preserve"> </w:t>
       </w:r>
-      <w:r>
+    </w:p>
+    <w:p>
+      <w:pPr>
+        <w:pStyle w:val="Paragrafoelenco"/>
+      </w:pPr>
+    </w:p>
+    <w:p>
+      <w:pPr>
+        <w:pStyle w:val="Paragrafoelenco"/>
+        <w:numPr>
+          <w:ilvl w:val="0"/>
+          <w:numId w:val="2"/>
+        </w:numPr>
+        <w:rPr>
+          <w:strike/>
+          <w:color w:val="FF0000"/>
+        </w:rPr>
+      </w:pPr>
+      <w:r>
+        <w:rPr>
+          <w:strike/>
+          <w:color w:val="FF0000"/>
+        </w:rPr>
         <w:t>{Io a questo punto ho fatto un capitolo “</w:t>
       </w:r>
       <w:r>
         <w:rPr>
           <w:b/>
           <w:bCs/>
+          <w:strike/>
+          <w:color w:val="FF0000"/>
         </w:rPr>
         <w:t>UNIONE: DB2 U DB3</w:t>
       </w:r>
       <w:r>
+        <w:rPr>
+          <w:strike/>
+          <w:color w:val="FF0000"/>
+        </w:rPr>
         <w:t>” con l’unione delle funzioni di db2 e db3, probabilmente superfluo}</w:t>
       </w:r>
       <w:r>
-        <w:t>. Come ultimo capitolo 6 “</w:t>
-      </w:r>
-      <w:r>
-        <w:rPr>
-          <w:b/>
-          <w:bCs/>
-        </w:rPr>
-        <w:t>FUNZIONI IN DB2 CHE NON SONO IN DB3 (DB2-DB3)”</w:t>
+        <w:rPr>
+          <w:strike/>
+          <w:color w:val="FF0000"/>
+        </w:rPr>
+        <w:t xml:space="preserve">. </w:t>
+      </w:r>
+    </w:p>
+    <w:p>
+      <w:pPr>
+        <w:pStyle w:val="Paragrafoelenco"/>
+      </w:pPr>
+    </w:p>
+    <w:p>
+      <w:pPr>
+        <w:pStyle w:val="Paragrafoelenco"/>
+        <w:numPr>
+          <w:ilvl w:val="0"/>
+          <w:numId w:val="2"/>
+        </w:numPr>
+      </w:pPr>
+      <w:r>
+        <w:t>Come ultimo capitolo 6</w:t>
+      </w:r>
+      <w:r>
+        <w:t xml:space="preserve"> vogliamo</w:t>
+      </w:r>
+      <w:r>
+        <w:t xml:space="preserve"> “</w:t>
+      </w:r>
+      <w:r>
+        <w:rPr>
+          <w:b/>
+          <w:bCs/>
+        </w:rPr>
+        <w:t xml:space="preserve">DEFINIZIONI </w:t>
+      </w:r>
+      <w:r>
+        <w:rPr>
+          <w:b/>
+          <w:bCs/>
+        </w:rPr>
+        <w:t>FUNZIONI IN DB2 CHE NON SONO IN DB3 (DB2-DB3)</w:t>
+      </w:r>
+      <w:proofErr w:type="gramStart"/>
+      <w:r>
+        <w:rPr>
+          <w:b/>
+          <w:bCs/>
+        </w:rPr>
+        <w:t>”</w:t>
       </w:r>
       <w:r>
         <w:rPr>
@@ -1673,27 +1977,50 @@
         <w:t xml:space="preserve"> </w:t>
       </w:r>
       <w:r>
-        <w:t xml:space="preserve">copia incollare, dal capitolo 4 e confrontandosi con il file </w:t>
-      </w:r>
-      <w:proofErr w:type="spellStart"/>
-      <w:r>
-        <w:t>excel</w:t>
-      </w:r>
-      <w:proofErr w:type="spellEnd"/>
-      <w:r>
-        <w:t xml:space="preserve"> o con il capitolo 3, le funzioni presenti in DB2 e non presenti in DB3. Una volta finito, copiare l’intero testo del capitolo 6 in </w:t>
-      </w:r>
-      <w:proofErr w:type="spellStart"/>
-      <w:r>
-        <w:t>pgAdmin</w:t>
-      </w:r>
-      <w:proofErr w:type="spellEnd"/>
-      <w:r>
-        <w:t xml:space="preserve">, </w:t>
-      </w:r>
-      <w:proofErr w:type="spellStart"/>
-      <w:r>
-        <w:t>db</w:t>
+        <w:rPr>
+          <w:b/>
+          <w:bCs/>
+        </w:rPr>
+        <w:t>.</w:t>
+      </w:r>
+      <w:proofErr w:type="gramEnd"/>
+      <w:r>
+        <w:rPr>
+          <w:b/>
+          <w:bCs/>
+        </w:rPr>
+        <w:t xml:space="preserve"> </w:t>
+      </w:r>
+      <w:r>
+        <w:t>Per ottenerlo dobbiamo sfruttare la tabella “</w:t>
+      </w:r>
+      <w:proofErr w:type="spellStart"/>
+      <w:r>
+        <w:t>funzioni_da_importare</w:t>
+      </w:r>
+      <w:proofErr w:type="spellEnd"/>
+      <w:r>
+        <w:t>” definita precedentemente. Copiare da DB2 la funzione “</w:t>
+      </w:r>
+      <w:proofErr w:type="spellStart"/>
+      <w:r>
+        <w:t>grc_lista_definizioni_funzioni_da_</w:t>
+      </w:r>
+      <w:proofErr w:type="gramStart"/>
+      <w:r>
+        <w:t>importare</w:t>
+      </w:r>
+      <w:proofErr w:type="spellEnd"/>
+      <w:r>
+        <w:t>(</w:t>
+      </w:r>
+      <w:proofErr w:type="gramEnd"/>
+      <w:r>
+        <w:t xml:space="preserve">)”  e la </w:t>
+      </w:r>
+      <w:proofErr w:type="spellStart"/>
+      <w:r>
+        <w:t>view</w:t>
       </w:r>
       <w:proofErr w:type="spellEnd"/>
       <w:r>
@@ -1701,11 +2028,49 @@
       </w:r>
       <w:proofErr w:type="spellStart"/>
       <w:r>
-        <w:t>GoricoProd</w:t>
-      </w:r>
-      <w:proofErr w:type="spellEnd"/>
-      <w:r>
-        <w:t>” (DB3) all’interno del query editor per aggiungere automaticamente le funzioni “nuove” nel DB3.</w:t>
+        <w:t>grc_lista_funzioni_da_importare</w:t>
+      </w:r>
+      <w:proofErr w:type="spellEnd"/>
+      <w:r>
+        <w:t xml:space="preserve">”. Una volta fatto, </w:t>
+      </w:r>
+      <w:proofErr w:type="spellStart"/>
+      <w:r>
+        <w:t>runnare</w:t>
+      </w:r>
+      <w:proofErr w:type="spellEnd"/>
+      <w:r>
+        <w:t xml:space="preserve"> da db2 la funzione</w:t>
+      </w:r>
+      <w:r>
+        <w:t xml:space="preserve"> “</w:t>
+      </w:r>
+      <w:proofErr w:type="spellStart"/>
+      <w:r>
+        <w:t>grc_lista_definizioni_funzioni_da_</w:t>
+      </w:r>
+      <w:proofErr w:type="gramStart"/>
+      <w:r>
+        <w:t>importare</w:t>
+      </w:r>
+      <w:proofErr w:type="spellEnd"/>
+      <w:r>
+        <w:t>(</w:t>
+      </w:r>
+      <w:proofErr w:type="gramEnd"/>
+      <w:r>
+        <w:t xml:space="preserve">)”  </w:t>
+      </w:r>
+      <w:r>
+        <w:t xml:space="preserve">che restituisce l’elenco delle definizioni delle funzioni che sono in DB2 ma non sono in DB3. Copiare tale lista nel capitolo 6 e </w:t>
+      </w:r>
+      <w:proofErr w:type="spellStart"/>
+      <w:r>
+        <w:t>runnare</w:t>
+      </w:r>
+      <w:proofErr w:type="spellEnd"/>
+      <w:r>
+        <w:t xml:space="preserve"> l’elenco intero in DB3 per aggiungere automaticamente le funzioni in DB3.</w:t>
       </w:r>
     </w:p>
     <w:p>
@@ -1773,21 +2138,88 @@
         <w:t>"</w:t>
       </w:r>
       <w:r>
-        <w:t xml:space="preserve"> in quanto non presente in db3 la tabella “transcodifiche”. Dopo averla manualmente aggiunta a db3 è stato possibile procedere e le due funzioni </w:t>
-      </w:r>
-      <w:r>
-        <w:t>"</w:t>
-      </w:r>
-      <w:proofErr w:type="spellStart"/>
-      <w:r>
-        <w:t>transcodifiche_transcodifica</w:t>
-      </w:r>
-      <w:proofErr w:type="spellEnd"/>
-      <w:r>
-        <w:t>"</w:t>
-      </w:r>
-      <w:r>
-        <w:t xml:space="preserve"> sono state aggiunte con successo.</w:t>
+        <w:t xml:space="preserve"> in quanto non presente in db3 la tabella “transcodifiche”. </w:t>
+      </w:r>
+      <w:r>
+        <w:t xml:space="preserve">Essa va aggiunta manualmente da DB2 a DB3. Per farlo dobbiamo creare un file </w:t>
+      </w:r>
+      <w:proofErr w:type="spellStart"/>
+      <w:r>
+        <w:t>excel</w:t>
+      </w:r>
+      <w:proofErr w:type="spellEnd"/>
+      <w:r>
+        <w:t xml:space="preserve"> vuoto da salvare, ad esempio, con il nome “transcodifiche.</w:t>
+      </w:r>
+      <w:proofErr w:type="spellStart"/>
+      <w:r>
+        <w:t>csv</w:t>
+      </w:r>
+      <w:proofErr w:type="spellEnd"/>
+      <w:proofErr w:type="gramStart"/>
+      <w:r>
+        <w:t>”.Una</w:t>
+      </w:r>
+      <w:proofErr w:type="gramEnd"/>
+      <w:r>
+        <w:t xml:space="preserve"> volta fatto, andare su </w:t>
+      </w:r>
+      <w:proofErr w:type="spellStart"/>
+      <w:r>
+        <w:t>pgadmin</w:t>
+      </w:r>
+      <w:proofErr w:type="spellEnd"/>
+      <w:r>
+        <w:t xml:space="preserve"> in db2, selezionare la tabella “transcodifiche”, tasto destro, EXPORT, selezionare il file </w:t>
+      </w:r>
+      <w:proofErr w:type="spellStart"/>
+      <w:r>
+        <w:t>csv</w:t>
+      </w:r>
+      <w:proofErr w:type="spellEnd"/>
+      <w:r>
+        <w:t xml:space="preserve"> appena salvato e utilizzare gli stessi parametri descritti prima (UTF8, </w:t>
+      </w:r>
+      <w:proofErr w:type="spellStart"/>
+      <w:r>
+        <w:t>header</w:t>
+      </w:r>
+      <w:proofErr w:type="spellEnd"/>
+      <w:r>
+        <w:t xml:space="preserve">,..). Tale operazione inserisce all’interno del file </w:t>
+      </w:r>
+      <w:proofErr w:type="spellStart"/>
+      <w:r>
+        <w:t>csv</w:t>
+      </w:r>
+      <w:proofErr w:type="spellEnd"/>
+      <w:r>
+        <w:t xml:space="preserve"> i dati contenuti nella tabella “transcodifiche” del DB2. Copiare l’SQL della tabella “transcodifiche” da DB2 e incollarlo sul query editor di DB3 per creare la tabella vuota “transcodifiche”. A questo punto fare tasto destro, IMPORT </w:t>
+      </w:r>
+      <w:r>
+        <w:sym w:font="Wingdings" w:char="F0E0"/>
+      </w:r>
+      <w:r>
+        <w:t xml:space="preserve"> file </w:t>
+      </w:r>
+      <w:proofErr w:type="gramStart"/>
+      <w:r>
+        <w:t>name :</w:t>
+      </w:r>
+      <w:proofErr w:type="gramEnd"/>
+      <w:r>
+        <w:t xml:space="preserve"> “transcodifiche.csv”</w:t>
+      </w:r>
+      <w:r>
+        <w:t xml:space="preserve"> con i soliti parametri. Questo procedimento permette il </w:t>
+      </w:r>
+      <w:proofErr w:type="spellStart"/>
+      <w:r>
+        <w:t>trasferiment</w:t>
+      </w:r>
+      <w:proofErr w:type="spellEnd"/>
+      <w:r>
+        <w:t xml:space="preserve"> delle funzioni di transcodifica. </w:t>
       </w:r>
     </w:p>
     <w:p>
@@ -1799,75 +2231,8 @@
         </w:numPr>
       </w:pPr>
       <w:r>
-        <w:t xml:space="preserve">2)  </w:t>
-      </w:r>
-      <w:r>
-        <w:t>"</w:t>
-      </w:r>
-      <w:proofErr w:type="spellStart"/>
-      <w:r>
-        <w:t>entrasp.grc_accoda_trattamenti_</w:t>
-      </w:r>
-      <w:proofErr w:type="gramStart"/>
-      <w:r>
-        <w:t>dati</w:t>
-      </w:r>
-      <w:proofErr w:type="spellEnd"/>
-      <w:r>
-        <w:t>(</w:t>
-      </w:r>
-      <w:proofErr w:type="gramEnd"/>
-      <w:r>
-        <w:t>"</w:t>
-      </w:r>
-      <w:proofErr w:type="spellStart"/>
-      <w:r>
-        <w:t>CodAzDaCuiCopiare</w:t>
-      </w:r>
-      <w:proofErr w:type="spellEnd"/>
-      <w:r>
-        <w:t>" text,"</w:t>
-      </w:r>
-      <w:proofErr w:type="spellStart"/>
-      <w:r>
-        <w:t>CodAzSuCuiCopiare</w:t>
-      </w:r>
-      <w:proofErr w:type="spellEnd"/>
-      <w:r>
-        <w:t>" text,"</w:t>
-      </w:r>
-      <w:proofErr w:type="spellStart"/>
-      <w:r>
-        <w:t>IdCentroGestionale</w:t>
-      </w:r>
-      <w:proofErr w:type="spellEnd"/>
-      <w:r>
-        <w:t xml:space="preserve">" </w:t>
-      </w:r>
-      <w:proofErr w:type="spellStart"/>
-      <w:r>
-        <w:t>integer</w:t>
-      </w:r>
-      <w:proofErr w:type="spellEnd"/>
-      <w:r>
-        <w:t>)"</w:t>
-      </w:r>
-      <w:r>
-        <w:t xml:space="preserve"> in quanto non presente la colonna “</w:t>
-      </w:r>
-      <w:proofErr w:type="spellStart"/>
-      <w:r>
-        <w:t>finalita_trattamento</w:t>
-      </w:r>
-      <w:proofErr w:type="spellEnd"/>
-      <w:r>
-        <w:t xml:space="preserve">” in </w:t>
-      </w:r>
-      <w:proofErr w:type="spellStart"/>
-      <w:r>
-        <w:t>cpl_trattamenti_dati</w:t>
-      </w:r>
-      <w:proofErr w:type="spellEnd"/>
+        <w:t>Non sono state aggiunte le seguenti funzioni:</w:t>
+      </w:r>
     </w:p>
     <w:p>
       <w:pPr>
@@ -1878,92 +2243,104 @@
         </w:numPr>
       </w:pPr>
       <w:r>
-        <w:lastRenderedPageBreak/>
-        <w:t xml:space="preserve">3) </w:t>
-      </w:r>
-      <w:r>
-        <w:t>"</w:t>
-      </w:r>
-      <w:proofErr w:type="spellStart"/>
-      <w:r>
-        <w:t>entrasp.grc_accoda_trattamenti_</w:t>
+        <w:t xml:space="preserve">1) </w:t>
+      </w:r>
+      <w:proofErr w:type="spellStart"/>
+      <w:r>
+        <w:t>anagrafiche_id_cod_</w:t>
       </w:r>
       <w:proofErr w:type="gramStart"/>
       <w:r>
+        <w:t>cognome</w:t>
+      </w:r>
+      <w:proofErr w:type="spellEnd"/>
+      <w:r>
+        <w:t xml:space="preserve"> :</w:t>
+      </w:r>
+      <w:proofErr w:type="gramEnd"/>
+      <w:r>
+        <w:t xml:space="preserve"> motivo sconosciuto</w:t>
+      </w:r>
+    </w:p>
+    <w:p>
+      <w:pPr>
+        <w:pStyle w:val="Paragrafoelenco"/>
+        <w:numPr>
+          <w:ilvl w:val="0"/>
+          <w:numId w:val="14"/>
+        </w:numPr>
+      </w:pPr>
+      <w:r>
+        <w:t xml:space="preserve">2) </w:t>
+      </w:r>
+      <w:proofErr w:type="spellStart"/>
+      <w:r>
+        <w:t>grc_accoda_trattamenti_</w:t>
+      </w:r>
+      <w:proofErr w:type="gramStart"/>
+      <w:r>
         <w:t>dati</w:t>
       </w:r>
       <w:proofErr w:type="spellEnd"/>
       <w:r>
-        <w:t>(</w:t>
+        <w:t xml:space="preserve"> :</w:t>
       </w:r>
       <w:proofErr w:type="gramEnd"/>
       <w:r>
-        <w:t>"</w:t>
-      </w:r>
-      <w:proofErr w:type="spellStart"/>
-      <w:r>
-        <w:t>CodAzDaCuiCopiare</w:t>
-      </w:r>
-      <w:proofErr w:type="spellEnd"/>
-      <w:r>
-        <w:t>" text,"</w:t>
-      </w:r>
-      <w:proofErr w:type="spellStart"/>
-      <w:r>
-        <w:t>CodAzSuCuiCopiare</w:t>
-      </w:r>
-      <w:proofErr w:type="spellEnd"/>
-      <w:r>
-        <w:t>" text,"</w:t>
-      </w:r>
-      <w:proofErr w:type="spellStart"/>
-      <w:r>
-        <w:t>IdCentroGestionale</w:t>
-      </w:r>
-      <w:proofErr w:type="spellEnd"/>
-      <w:r>
-        <w:t xml:space="preserve">" </w:t>
-      </w:r>
-      <w:proofErr w:type="spellStart"/>
-      <w:r>
-        <w:t>integer</w:t>
-      </w:r>
-      <w:proofErr w:type="spellEnd"/>
-      <w:r>
-        <w:t>,"</w:t>
-      </w:r>
-      <w:proofErr w:type="spellStart"/>
-      <w:r>
-        <w:t>IdTitolareTrattamento</w:t>
-      </w:r>
-      <w:proofErr w:type="spellEnd"/>
-      <w:r>
-        <w:t xml:space="preserve">" </w:t>
-      </w:r>
-      <w:proofErr w:type="spellStart"/>
-      <w:r>
-        <w:t>integer</w:t>
-      </w:r>
-      <w:proofErr w:type="spellEnd"/>
-      <w:r>
-        <w:t xml:space="preserve">" </w:t>
-      </w:r>
-      <w:r>
-        <w:t>in quanto non presente la colonna “</w:t>
-      </w:r>
-      <w:proofErr w:type="spellStart"/>
-      <w:r>
-        <w:t>finalita_trattamento</w:t>
-      </w:r>
-      <w:proofErr w:type="spellEnd"/>
-      <w:r>
-        <w:t xml:space="preserve">” in </w:t>
-      </w:r>
-      <w:proofErr w:type="spellStart"/>
-      <w:r>
-        <w:t>cpl_trattamenti_dati</w:t>
-      </w:r>
-      <w:proofErr w:type="spellEnd"/>
+        <w:t xml:space="preserve"> questo perché DB2 ha 3 funzioni con lo stesso nome “</w:t>
+      </w:r>
+      <w:proofErr w:type="spellStart"/>
+      <w:r>
+        <w:t>grc_accoda_trattamenti_dati</w:t>
+      </w:r>
+      <w:proofErr w:type="spellEnd"/>
+      <w:r>
+        <w:t xml:space="preserve">” e DB3 ne ha 1. La funzione </w:t>
+      </w:r>
+      <w:proofErr w:type="spellStart"/>
+      <w:proofErr w:type="gramStart"/>
+      <w:r>
+        <w:t>cerca.vert</w:t>
+      </w:r>
+      <w:proofErr w:type="spellEnd"/>
+      <w:proofErr w:type="gramEnd"/>
+      <w:r>
+        <w:t xml:space="preserve"> non segnala il fatto che DB2 ne ha tre e DB3 una, trova semplicemente la corrispondenza e non segnala nulla. Per tal motivo le 2 funzioni mancanti vanno aggiunte a mano.</w:t>
+      </w:r>
+    </w:p>
+    <w:p>
+      <w:pPr>
+        <w:pStyle w:val="Paragrafoelenco"/>
+        <w:numPr>
+          <w:ilvl w:val="0"/>
+          <w:numId w:val="14"/>
+        </w:numPr>
+      </w:pPr>
+      <w:r>
+        <w:t>3)</w:t>
+      </w:r>
+      <w:proofErr w:type="spellStart"/>
+      <w:r>
+        <w:t>grc_</w:t>
+      </w:r>
+      <w:proofErr w:type="gramStart"/>
+      <w:r>
+        <w:t>accodamentoperrischioperativi</w:t>
+      </w:r>
+      <w:proofErr w:type="spellEnd"/>
+      <w:r>
+        <w:t xml:space="preserve"> :</w:t>
+      </w:r>
+      <w:proofErr w:type="gramEnd"/>
+      <w:r>
+        <w:t xml:space="preserve"> stesso motivo spiegato sopra </w:t>
+      </w:r>
+      <w:r>
+        <w:sym w:font="Wingdings" w:char="F0E0"/>
+      </w:r>
+      <w:r>
+        <w:t>aggiunta a mano</w:t>
+      </w:r>
     </w:p>
     <w:p>
       <w:pPr>
@@ -1981,228 +2358,289 @@
       </w:pPr>
       <w:r>
         <w:rPr>
+          <w:sz w:val="24"/>
+          <w:szCs w:val="24"/>
+        </w:rPr>
+        <w:t>Si precisa che in caso delle funzioni esistano in entrambi i database dovranno prevalere quelle di DB2 rispetto a quelle di DB1 (</w:t>
+      </w:r>
+      <w:r>
+        <w:rPr>
+          <w:sz w:val="24"/>
+          <w:szCs w:val="24"/>
+          <w:highlight w:val="yellow"/>
+        </w:rPr>
+        <w:t>ma prima confrontarsi con Amedeo</w:t>
+      </w:r>
+      <w:r>
+        <w:rPr>
+          <w:sz w:val="24"/>
+          <w:szCs w:val="24"/>
+        </w:rPr>
+        <w:sym w:font="Wingdings" w:char="F0E0"/>
+      </w:r>
+      <w:r>
+        <w:rPr>
+          <w:sz w:val="24"/>
+          <w:szCs w:val="24"/>
+        </w:rPr>
+        <w:t>è stata eseguita la procedura appena spiegata)</w:t>
+      </w:r>
+    </w:p>
+    <w:p>
+      <w:pPr>
+        <w:ind w:left="690"/>
+        <w:rPr>
+          <w:b/>
+          <w:bCs/>
           <w:color w:val="FF0000"/>
           <w:sz w:val="24"/>
           <w:szCs w:val="24"/>
         </w:rPr>
-        <w:t xml:space="preserve">ATTENZIONE: </w:t>
+      </w:pPr>
+      <w:r>
+        <w:rPr>
+          <w:b/>
+          <w:bCs/>
+          <w:color w:val="FF0000"/>
+          <w:sz w:val="24"/>
+          <w:szCs w:val="24"/>
+        </w:rPr>
+        <w:t>NOTE</w:t>
+      </w:r>
+      <w:r>
+        <w:rPr>
+          <w:b/>
+          <w:bCs/>
+          <w:color w:val="FF0000"/>
+          <w:sz w:val="24"/>
+          <w:szCs w:val="24"/>
+        </w:rPr>
+        <w:t xml:space="preserve">: sono i capitoli delle liste e delle definizioni superflui o possono servire come backup? </w:t>
       </w:r>
       <w:proofErr w:type="gramStart"/>
       <w:r>
         <w:rPr>
+          <w:b/>
+          <w:bCs/>
           <w:color w:val="FF0000"/>
           <w:sz w:val="24"/>
           <w:szCs w:val="24"/>
         </w:rPr>
-        <w:t xml:space="preserve">bug </w:t>
-      </w:r>
-      <w:r>
-        <w:rPr>
+        <w:t>Alla fine</w:t>
+      </w:r>
+      <w:proofErr w:type="gramEnd"/>
+      <w:r>
+        <w:rPr>
+          <w:b/>
+          <w:bCs/>
+          <w:color w:val="FF0000"/>
+          <w:sz w:val="24"/>
+          <w:szCs w:val="24"/>
+        </w:rPr>
+        <w:t xml:space="preserve"> si può fare tutto anche senza file word</w:t>
+      </w:r>
+      <w:r>
+        <w:rPr>
+          <w:b/>
+          <w:bCs/>
+          <w:color w:val="FF0000"/>
+          <w:sz w:val="24"/>
+          <w:szCs w:val="24"/>
+        </w:rPr>
+        <w:t xml:space="preserve"> ma utilizzando solo </w:t>
+      </w:r>
+      <w:proofErr w:type="spellStart"/>
+      <w:r>
+        <w:rPr>
+          <w:b/>
+          <w:bCs/>
+          <w:color w:val="FF0000"/>
+          <w:sz w:val="24"/>
+          <w:szCs w:val="24"/>
+        </w:rPr>
+        <w:t>l’excel</w:t>
+      </w:r>
+      <w:proofErr w:type="spellEnd"/>
+      <w:r>
+        <w:rPr>
+          <w:b/>
+          <w:bCs/>
+          <w:color w:val="FF0000"/>
+          <w:sz w:val="24"/>
+          <w:szCs w:val="24"/>
+        </w:rPr>
+        <w:t>!</w:t>
+      </w:r>
+    </w:p>
+    <w:p>
+      <w:pPr>
+        <w:ind w:left="690"/>
+        <w:rPr>
+          <w:sz w:val="24"/>
+          <w:szCs w:val="24"/>
+        </w:rPr>
+      </w:pPr>
+      <w:r>
+        <w:rPr>
+          <w:sz w:val="24"/>
+          <w:szCs w:val="24"/>
+          <w:highlight w:val="green"/>
+        </w:rPr>
+        <w:t>DOVE TROVARE I FILE WORD ED EXCEL</w:t>
+      </w:r>
+      <w:r>
+        <w:rPr>
+          <w:sz w:val="24"/>
+          <w:szCs w:val="24"/>
+        </w:rPr>
+        <w:t>: all’interno della cartella condivisa “fuse-angular</w:t>
+      </w:r>
+      <w:r>
+        <w:rPr>
+          <w:sz w:val="24"/>
+          <w:szCs w:val="24"/>
+        </w:rPr>
+        <w:t>”</w:t>
+      </w:r>
+      <w:r>
+        <w:rPr>
+          <w:sz w:val="24"/>
+          <w:szCs w:val="24"/>
+        </w:rPr>
+        <w:sym w:font="Wingdings" w:char="F0E0"/>
+      </w:r>
+      <w:r>
+        <w:rPr>
+          <w:sz w:val="24"/>
+          <w:szCs w:val="24"/>
+        </w:rPr>
+        <w:t>docs</w:t>
+      </w:r>
+      <w:r>
+        <w:rPr>
+          <w:sz w:val="24"/>
+          <w:szCs w:val="24"/>
+        </w:rPr>
+        <w:sym w:font="Wingdings" w:char="F0E0"/>
+      </w:r>
+      <w:r>
+        <w:rPr>
+          <w:sz w:val="24"/>
+          <w:szCs w:val="24"/>
+        </w:rPr>
+        <w:t>ProceduraDiMigrazione</w:t>
+      </w:r>
+    </w:p>
+    <w:p/>
+    <w:p/>
+    <w:p/>
+    <w:p>
+      <w:pPr>
+        <w:rPr>
+          <w:b/>
+          <w:sz w:val="24"/>
+          <w:szCs w:val="24"/>
+        </w:rPr>
+      </w:pPr>
+      <w:r>
+        <w:rPr>
+          <w:b/>
+          <w:sz w:val="24"/>
+          <w:szCs w:val="24"/>
+          <w:u w:val="single"/>
+        </w:rPr>
+        <w:lastRenderedPageBreak/>
+        <w:t>VIEW</w:t>
+      </w:r>
+      <w:r>
+        <w:rPr>
+          <w:b/>
           <w:sz w:val="24"/>
           <w:szCs w:val="24"/>
         </w:rPr>
         <w:t>:</w:t>
       </w:r>
+    </w:p>
+    <w:p>
+      <w:pPr>
+        <w:rPr>
+          <w:sz w:val="24"/>
+          <w:szCs w:val="24"/>
+        </w:rPr>
+      </w:pPr>
+      <w:r>
+        <w:rPr>
+          <w:sz w:val="24"/>
+          <w:szCs w:val="24"/>
+        </w:rPr>
+        <w:t xml:space="preserve">Le </w:t>
+      </w:r>
+      <w:proofErr w:type="spellStart"/>
+      <w:r>
+        <w:rPr>
+          <w:sz w:val="24"/>
+          <w:szCs w:val="24"/>
+        </w:rPr>
+        <w:t>view</w:t>
+      </w:r>
+      <w:proofErr w:type="spellEnd"/>
+      <w:r>
+        <w:rPr>
+          <w:sz w:val="24"/>
+          <w:szCs w:val="24"/>
+        </w:rPr>
+        <w:t xml:space="preserve"> sono meno problematiche. Nella prova eseguita i giorni 03-03-2020 e 05-03-2020, le </w:t>
+      </w:r>
+      <w:proofErr w:type="spellStart"/>
+      <w:r>
+        <w:rPr>
+          <w:sz w:val="24"/>
+          <w:szCs w:val="24"/>
+        </w:rPr>
+        <w:t>view</w:t>
+      </w:r>
+      <w:proofErr w:type="spellEnd"/>
+      <w:r>
+        <w:rPr>
+          <w:sz w:val="24"/>
+          <w:szCs w:val="24"/>
+        </w:rPr>
+        <w:t xml:space="preserve"> da trasferire da DB2 a DB3 sono state in totale 16. Ho optato quindi per un procedimento “manuale” di copia-incollaggio che è durato </w:t>
+      </w:r>
+      <w:proofErr w:type="gramStart"/>
+      <w:r>
+        <w:rPr>
+          <w:sz w:val="24"/>
+          <w:szCs w:val="24"/>
+        </w:rPr>
+        <w:t>5</w:t>
+      </w:r>
       <w:proofErr w:type="gramEnd"/>
       <w:r>
         <w:rPr>
           <w:sz w:val="24"/>
           <w:szCs w:val="24"/>
         </w:rPr>
-        <w:t xml:space="preserve"> </w:t>
-      </w:r>
-      <w:r>
-        <w:rPr>
-          <w:sz w:val="24"/>
-          <w:szCs w:val="24"/>
-        </w:rPr>
-        <w:t>la funzione “</w:t>
-      </w:r>
-      <w:proofErr w:type="spellStart"/>
-      <w:r>
-        <w:t>grc_lista_definizioni_</w:t>
-      </w:r>
-      <w:r>
-        <w:t>funzioni</w:t>
-      </w:r>
-      <w:proofErr w:type="spellEnd"/>
-      <w:r>
-        <w:t>()</w:t>
-      </w:r>
-      <w:r>
-        <w:t xml:space="preserve">” </w:t>
-      </w:r>
-      <w:r>
-        <w:rPr>
-          <w:sz w:val="24"/>
-          <w:szCs w:val="24"/>
-        </w:rPr>
-        <w:t>non rileva le fu</w:t>
-      </w:r>
-      <w:r>
-        <w:rPr>
-          <w:sz w:val="24"/>
-          <w:szCs w:val="24"/>
-        </w:rPr>
-        <w:t>n</w:t>
-      </w:r>
-      <w:r>
-        <w:rPr>
-          <w:sz w:val="24"/>
-          <w:szCs w:val="24"/>
-        </w:rPr>
-        <w:t>zioni con stesso nome e param</w:t>
-      </w:r>
-      <w:r>
-        <w:rPr>
-          <w:sz w:val="24"/>
-          <w:szCs w:val="24"/>
-        </w:rPr>
-        <w:t>etri</w:t>
-      </w:r>
-      <w:r>
-        <w:rPr>
-          <w:sz w:val="24"/>
-          <w:szCs w:val="24"/>
-        </w:rPr>
-        <w:t xml:space="preserve"> diversi.</w:t>
-      </w:r>
-      <w:r>
-        <w:rPr>
-          <w:sz w:val="24"/>
-          <w:szCs w:val="24"/>
-        </w:rPr>
-        <w:t xml:space="preserve"> Tali funzioni sono state aggiunte a mano.</w:t>
-      </w:r>
-    </w:p>
-    <w:p>
-      <w:pPr>
-        <w:ind w:left="690"/>
-        <w:rPr>
-          <w:sz w:val="24"/>
-          <w:szCs w:val="24"/>
-        </w:rPr>
-      </w:pPr>
-      <w:r>
-        <w:rPr>
-          <w:sz w:val="24"/>
-          <w:szCs w:val="24"/>
-        </w:rPr>
-        <w:t>Si precisa che in caso delle funzioni esistano in entrambi i database dovranno prevalere quelle di DB2 rispetto a quelle di DB1 (</w:t>
-      </w:r>
-      <w:r>
-        <w:rPr>
-          <w:sz w:val="24"/>
-          <w:szCs w:val="24"/>
-          <w:highlight w:val="yellow"/>
-        </w:rPr>
-        <w:t>ma prima confrontarsi con Amedeo</w:t>
-      </w:r>
-      <w:r>
-        <w:rPr>
-          <w:sz w:val="24"/>
-          <w:szCs w:val="24"/>
-        </w:rPr>
-        <w:sym w:font="Wingdings" w:char="F0E0"/>
-      </w:r>
-      <w:r>
-        <w:rPr>
-          <w:sz w:val="24"/>
-          <w:szCs w:val="24"/>
-        </w:rPr>
-        <w:t>è stata eseguita la procedura appena spiegata)</w:t>
-      </w:r>
-    </w:p>
-    <w:p>
-      <w:pPr>
-        <w:ind w:left="690"/>
-        <w:rPr>
-          <w:sz w:val="24"/>
-          <w:szCs w:val="24"/>
-        </w:rPr>
-      </w:pPr>
-      <w:r>
-        <w:rPr>
-          <w:sz w:val="24"/>
-          <w:szCs w:val="24"/>
-          <w:highlight w:val="green"/>
-        </w:rPr>
-        <w:t>DOVE TROVARE I FILE WORD ED EXCEL</w:t>
-      </w:r>
-      <w:r>
-        <w:rPr>
-          <w:sz w:val="24"/>
-          <w:szCs w:val="24"/>
-        </w:rPr>
-        <w:t>: all’interno della cartella condivisa “fuse-angular</w:t>
-      </w:r>
-      <w:r>
-        <w:rPr>
-          <w:sz w:val="24"/>
-          <w:szCs w:val="24"/>
-        </w:rPr>
-        <w:t>”</w:t>
-      </w:r>
-      <w:r>
-        <w:rPr>
-          <w:sz w:val="24"/>
-          <w:szCs w:val="24"/>
-        </w:rPr>
-        <w:sym w:font="Wingdings" w:char="F0E0"/>
-      </w:r>
-      <w:r>
-        <w:rPr>
-          <w:sz w:val="24"/>
-          <w:szCs w:val="24"/>
-        </w:rPr>
-        <w:t>docs</w:t>
-      </w:r>
-      <w:r>
-        <w:rPr>
-          <w:sz w:val="24"/>
-          <w:szCs w:val="24"/>
-        </w:rPr>
-        <w:sym w:font="Wingdings" w:char="F0E0"/>
-      </w:r>
-      <w:r>
-        <w:rPr>
-          <w:sz w:val="24"/>
-          <w:szCs w:val="24"/>
-        </w:rPr>
-        <w:t>ProceduraDiMigrazione</w:t>
-      </w:r>
-      <w:bookmarkStart w:id="1" w:name="_GoBack"/>
-      <w:bookmarkEnd w:id="1"/>
-    </w:p>
-    <w:p/>
-    <w:p>
-      <w:pPr>
-        <w:rPr>
-          <w:b/>
-          <w:sz w:val="24"/>
-          <w:szCs w:val="24"/>
-        </w:rPr>
-      </w:pPr>
-      <w:r>
-        <w:rPr>
-          <w:b/>
-          <w:sz w:val="24"/>
-          <w:szCs w:val="24"/>
-        </w:rPr>
-        <w:t>Procedura p</w:t>
-      </w:r>
-      <w:r>
-        <w:rPr>
-          <w:b/>
-          <w:sz w:val="24"/>
-          <w:szCs w:val="24"/>
-        </w:rPr>
-        <w:t xml:space="preserve">er ottenere l’unione delle </w:t>
-      </w:r>
-      <w:proofErr w:type="spellStart"/>
-      <w:r>
-        <w:rPr>
-          <w:b/>
+        <w:t xml:space="preserve"> minuti. In un’altra situazione, dove il copia-incollaggio dovesse risultare troppo oneroso, si può certamente eseguire una procedura analoga a quella descritta per il trasferimento delle funzioni.</w:t>
+      </w:r>
+    </w:p>
+    <w:p>
+      <w:pPr>
+        <w:rPr>
+          <w:sz w:val="24"/>
+          <w:szCs w:val="24"/>
+        </w:rPr>
+      </w:pPr>
+      <w:r>
+        <w:rPr>
+          <w:sz w:val="24"/>
+          <w:szCs w:val="24"/>
+        </w:rPr>
+        <w:t xml:space="preserve">Effettivamente è stato eseguito un approccio identico a quello usato per le funzioni per definire le liste delle </w:t>
+      </w:r>
+      <w:proofErr w:type="spellStart"/>
+      <w:r>
+        <w:rPr>
           <w:sz w:val="24"/>
           <w:szCs w:val="24"/>
         </w:rPr>
@@ -2211,94 +2649,43 @@
       <w:proofErr w:type="spellEnd"/>
       <w:r>
         <w:rPr>
-          <w:b/>
-          <w:sz w:val="24"/>
-          <w:szCs w:val="24"/>
-        </w:rPr>
-        <w:t>:</w:t>
-      </w:r>
-    </w:p>
-    <w:p>
-      <w:pPr>
-        <w:rPr>
-          <w:sz w:val="24"/>
-          <w:szCs w:val="24"/>
-        </w:rPr>
-      </w:pPr>
-      <w:r>
-        <w:rPr>
-          <w:sz w:val="24"/>
-          <w:szCs w:val="24"/>
-        </w:rPr>
-        <w:t>S</w:t>
-      </w:r>
-      <w:r>
-        <w:rPr>
-          <w:sz w:val="24"/>
-          <w:szCs w:val="24"/>
-        </w:rPr>
-        <w:t xml:space="preserve">i eseguono gli stessi passaggi effettuati per le funzioni utilizzando </w:t>
-      </w:r>
-      <w:proofErr w:type="spellStart"/>
-      <w:r>
-        <w:rPr>
-          <w:sz w:val="24"/>
-          <w:szCs w:val="24"/>
-        </w:rPr>
-        <w:t>grc_lista_views</w:t>
-      </w:r>
-      <w:proofErr w:type="spellEnd"/>
-      <w:r>
-        <w:rPr>
-          <w:sz w:val="24"/>
-          <w:szCs w:val="24"/>
-        </w:rPr>
-        <w:t xml:space="preserve"> e </w:t>
-      </w:r>
-      <w:proofErr w:type="spellStart"/>
-      <w:r>
-        <w:rPr>
-          <w:sz w:val="24"/>
-          <w:szCs w:val="24"/>
-        </w:rPr>
-        <w:t>grc_lista_definizioni_</w:t>
-      </w:r>
+          <w:sz w:val="24"/>
+          <w:szCs w:val="24"/>
+        </w:rPr>
+        <w:t xml:space="preserve"> di DB2 e di DB3. Il confronto tra le due liste può essere fatto tranquillamente a mano mettendo in ordine alfabetico le 2 liste e annotando le </w:t>
+      </w:r>
+      <w:proofErr w:type="spellStart"/>
+      <w:r>
+        <w:rPr>
+          <w:sz w:val="24"/>
+          <w:szCs w:val="24"/>
+        </w:rPr>
+        <w:t>view</w:t>
+      </w:r>
+      <w:proofErr w:type="spellEnd"/>
+      <w:r>
+        <w:rPr>
+          <w:sz w:val="24"/>
+          <w:szCs w:val="24"/>
+        </w:rPr>
+        <w:t xml:space="preserve"> che sono in DB2 e che non sono in DB3 oppure tramite la solita funzione </w:t>
+      </w:r>
+      <w:proofErr w:type="spellStart"/>
       <w:proofErr w:type="gramStart"/>
       <w:r>
         <w:rPr>
           <w:sz w:val="24"/>
           <w:szCs w:val="24"/>
         </w:rPr>
-        <w:t>views</w:t>
-      </w:r>
-      <w:proofErr w:type="spellEnd"/>
-      <w:r>
-        <w:rPr>
-          <w:sz w:val="24"/>
-          <w:szCs w:val="24"/>
-        </w:rPr>
-        <w:t>(</w:t>
-      </w:r>
+        <w:t>cerca.vert</w:t>
+      </w:r>
+      <w:proofErr w:type="spellEnd"/>
       <w:proofErr w:type="gramEnd"/>
       <w:r>
         <w:rPr>
           <w:sz w:val="24"/>
           <w:szCs w:val="24"/>
         </w:rPr>
-        <w:t>)</w:t>
-      </w:r>
-      <w:r>
-        <w:rPr>
-          <w:sz w:val="24"/>
-          <w:szCs w:val="24"/>
-        </w:rPr>
-        <w:t xml:space="preserve"> presenti su DB2</w:t>
-      </w:r>
-      <w:r>
-        <w:rPr>
-          <w:sz w:val="24"/>
-          <w:szCs w:val="24"/>
-        </w:rPr>
         <w:t xml:space="preserve">. </w:t>
       </w:r>
     </w:p>
@@ -2314,104 +2701,17 @@
           <w:sz w:val="24"/>
           <w:szCs w:val="24"/>
         </w:rPr>
-        <w:t>F</w:t>
-      </w:r>
-      <w:r>
-        <w:rPr>
-          <w:sz w:val="24"/>
-          <w:szCs w:val="24"/>
-        </w:rPr>
-        <w:t xml:space="preserve">ile word </w:t>
-      </w:r>
-      <w:r>
-        <w:rPr>
-          <w:sz w:val="24"/>
-          <w:szCs w:val="24"/>
-        </w:rPr>
-        <w:t>“</w:t>
-      </w:r>
-      <w:proofErr w:type="spellStart"/>
-      <w:r>
-        <w:rPr>
-          <w:sz w:val="24"/>
-          <w:szCs w:val="24"/>
-        </w:rPr>
-        <w:t>view_gorico_</w:t>
-      </w:r>
-      <w:proofErr w:type="gramStart"/>
-      <w:r>
-        <w:rPr>
-          <w:sz w:val="24"/>
-          <w:szCs w:val="24"/>
-        </w:rPr>
-        <w:t>goricoprod”</w:t>
-      </w:r>
-      <w:r>
-        <w:rPr>
-          <w:sz w:val="24"/>
-          <w:szCs w:val="24"/>
-        </w:rPr>
-        <w:t>con</w:t>
-      </w:r>
-      <w:proofErr w:type="spellEnd"/>
-      <w:proofErr w:type="gramEnd"/>
-      <w:r>
-        <w:rPr>
-          <w:sz w:val="24"/>
-          <w:szCs w:val="24"/>
-        </w:rPr>
-        <w:t xml:space="preserve"> list</w:t>
-      </w:r>
-      <w:r>
-        <w:rPr>
-          <w:sz w:val="24"/>
-          <w:szCs w:val="24"/>
-        </w:rPr>
-        <w:t>e</w:t>
-      </w:r>
-      <w:r>
-        <w:rPr>
-          <w:sz w:val="24"/>
-          <w:szCs w:val="24"/>
-        </w:rPr>
-        <w:t xml:space="preserve"> e list</w:t>
-      </w:r>
-      <w:r>
-        <w:rPr>
-          <w:sz w:val="24"/>
-          <w:szCs w:val="24"/>
-        </w:rPr>
-        <w:t>e</w:t>
-      </w:r>
-      <w:r>
-        <w:rPr>
-          <w:sz w:val="24"/>
-          <w:szCs w:val="24"/>
-        </w:rPr>
-        <w:t xml:space="preserve"> definizioni</w:t>
-      </w:r>
-      <w:r>
-        <w:rPr>
-          <w:sz w:val="24"/>
-          <w:szCs w:val="24"/>
-        </w:rPr>
-        <w:t xml:space="preserve">, </w:t>
-      </w:r>
-    </w:p>
-    <w:p>
-      <w:pPr>
-        <w:rPr>
-          <w:sz w:val="24"/>
-          <w:szCs w:val="24"/>
-        </w:rPr>
-      </w:pPr>
-      <w:r>
-        <w:rPr>
-          <w:sz w:val="24"/>
-          <w:szCs w:val="24"/>
-        </w:rPr>
-        <w:t>CAPITOLI</w:t>
-      </w:r>
+        <w:t xml:space="preserve">Nel file word precedentemente definito sono stati definiti quindi i seguenti capitoli relativi alle </w:t>
+      </w:r>
+      <w:proofErr w:type="spellStart"/>
+      <w:r>
+        <w:rPr>
+          <w:sz w:val="24"/>
+          <w:szCs w:val="24"/>
+        </w:rPr>
+        <w:t>view</w:t>
+      </w:r>
+      <w:proofErr w:type="spellEnd"/>
       <w:r>
         <w:rPr>
           <w:sz w:val="24"/>
@@ -2433,14 +2733,46 @@
         </w:rPr>
       </w:pPr>
       <w:r>
-        <w:t xml:space="preserve"> </w:t>
-      </w:r>
-      <w:r>
-        <w:rPr>
-          <w:b/>
-          <w:bCs/>
-        </w:rPr>
-        <w:t>VIEW DB2,</w:t>
+        <w:rPr>
+          <w:b/>
+          <w:bCs/>
+        </w:rPr>
+        <w:t xml:space="preserve">LISTA </w:t>
+      </w:r>
+      <w:r>
+        <w:rPr>
+          <w:b/>
+          <w:bCs/>
+        </w:rPr>
+        <w:t xml:space="preserve">VIEW </w:t>
+      </w:r>
+      <w:r>
+        <w:rPr>
+          <w:b/>
+          <w:bCs/>
+        </w:rPr>
+        <w:t>GORICO (</w:t>
+      </w:r>
+      <w:r>
+        <w:rPr>
+          <w:b/>
+          <w:bCs/>
+        </w:rPr>
+        <w:t>DB2</w:t>
+      </w:r>
+      <w:r>
+        <w:rPr>
+          <w:b/>
+          <w:bCs/>
+        </w:rPr>
+        <w:t>)</w:t>
+      </w:r>
+      <w:r>
+        <w:rPr>
+          <w:b/>
+          <w:bCs/>
+        </w:rPr>
+        <w:t>,</w:t>
       </w:r>
     </w:p>
     <w:p>
@@ -2460,6 +2792,27 @@
           <w:b/>
           <w:bCs/>
         </w:rPr>
+        <w:t xml:space="preserve">LISTA </w:t>
+      </w:r>
+      <w:r>
+        <w:rPr>
+          <w:b/>
+          <w:bCs/>
+        </w:rPr>
+        <w:t>VIEW</w:t>
+      </w:r>
+      <w:r>
+        <w:rPr>
+          <w:b/>
+          <w:bCs/>
+        </w:rPr>
+        <w:t xml:space="preserve"> GORICOPROD</w:t>
+      </w:r>
+      <w:r>
+        <w:rPr>
+          <w:b/>
+          <w:bCs/>
+        </w:rPr>
         <w:t xml:space="preserve"> </w:t>
       </w:r>
       <w:r>
@@ -2467,14 +2820,28 @@
           <w:b/>
           <w:bCs/>
         </w:rPr>
-        <w:t>VIEW DB</w:t>
-      </w:r>
-      <w:r>
-        <w:rPr>
-          <w:b/>
-          <w:bCs/>
-        </w:rPr>
-        <w:t>3,</w:t>
+        <w:t>(</w:t>
+      </w:r>
+      <w:r>
+        <w:rPr>
+          <w:b/>
+          <w:bCs/>
+        </w:rPr>
+        <w:t>DB3</w:t>
+      </w:r>
+      <w:r>
+        <w:rPr>
+          <w:b/>
+          <w:bCs/>
+        </w:rPr>
+        <w:t>)</w:t>
+      </w:r>
+      <w:r>
+        <w:rPr>
+          <w:b/>
+          <w:bCs/>
+        </w:rPr>
+        <w:t>,</w:t>
       </w:r>
     </w:p>
     <w:p>
@@ -2489,270 +2856,106 @@
           <w:bCs/>
         </w:rPr>
       </w:pPr>
-      <w:proofErr w:type="gramStart"/>
-      <w:r>
-        <w:rPr>
-          <w:b/>
-          <w:bCs/>
-        </w:rPr>
-        <w:t>CONFRONTO(</w:t>
-      </w:r>
-      <w:proofErr w:type="gramEnd"/>
-      <w:r>
-        <w:rPr>
-          <w:b/>
-          <w:bCs/>
-        </w:rPr>
-        <w:t>GIALLE SOLO IN DB2),</w:t>
+      <w:r>
+        <w:rPr>
+          <w:b/>
+          <w:bCs/>
+        </w:rPr>
+        <w:t>LISTA VIEW IN DB2 CHE NON CI SONO IN DB3 (DB2-DB3)</w:t>
       </w:r>
     </w:p>
     <w:p>
       <w:pPr>
         <w:pStyle w:val="Paragrafoelenco"/>
-        <w:numPr>
-          <w:ilvl w:val="0"/>
-          <w:numId w:val="15"/>
-        </w:numPr>
-        <w:rPr>
-          <w:b/>
-          <w:bCs/>
-        </w:rPr>
-      </w:pPr>
-      <w:r>
-        <w:rPr>
-          <w:b/>
-          <w:bCs/>
-        </w:rPr>
-        <w:t xml:space="preserve">DEFINIZIONI VIEW DB2, </w:t>
-      </w:r>
-      <w:r>
-        <w:rPr>
-          <w:b/>
-          <w:bCs/>
-        </w:rPr>
-        <w:t>DEFINIZIONI VIEW DB</w:t>
-      </w:r>
-      <w:r>
-        <w:rPr>
-          <w:b/>
-          <w:bCs/>
-        </w:rPr>
-        <w:t>3,</w:t>
-      </w:r>
-    </w:p>
-    <w:p>
-      <w:pPr>
-        <w:pStyle w:val="Paragrafoelenco"/>
-        <w:numPr>
-          <w:ilvl w:val="0"/>
-          <w:numId w:val="15"/>
-        </w:numPr>
-        <w:rPr>
-          <w:b/>
-          <w:bCs/>
-        </w:rPr>
-      </w:pPr>
-      <w:r>
-        <w:rPr>
-          <w:b/>
-          <w:bCs/>
-        </w:rPr>
-        <w:t>VIEW DB2 CHE NON CI SONO IN DB3 (DB2-DB3</w:t>
-      </w:r>
-      <w:proofErr w:type="gramStart"/>
-      <w:r>
-        <w:rPr>
-          <w:b/>
-          <w:bCs/>
-        </w:rPr>
-        <w:t>)</w:t>
-      </w:r>
-      <w:r>
-        <w:rPr>
-          <w:b/>
-          <w:bCs/>
+        <w:rPr>
+          <w:b/>
+          <w:bCs/>
+        </w:rPr>
+      </w:pPr>
+    </w:p>
+    <w:p>
+      <w:pPr>
+        <w:rPr>
+          <w:b/>
+          <w:bCs/>
+          <w:sz w:val="24"/>
+          <w:szCs w:val="24"/>
+        </w:rPr>
+      </w:pPr>
+      <w:r>
+        <w:rPr>
+          <w:sz w:val="24"/>
+          <w:szCs w:val="24"/>
+        </w:rPr>
+        <w:t xml:space="preserve">Il procedimento di aggiunta delle </w:t>
+      </w:r>
+      <w:proofErr w:type="spellStart"/>
+      <w:r>
+        <w:rPr>
+          <w:sz w:val="24"/>
+          <w:szCs w:val="24"/>
+        </w:rPr>
+        <w:t>view</w:t>
+      </w:r>
+      <w:proofErr w:type="spellEnd"/>
+      <w:r>
+        <w:rPr>
+          <w:sz w:val="24"/>
+          <w:szCs w:val="24"/>
+        </w:rPr>
+        <w:t xml:space="preserve"> in DB3, nel caso delle </w:t>
+      </w:r>
+      <w:proofErr w:type="spellStart"/>
+      <w:r>
+        <w:rPr>
+          <w:sz w:val="24"/>
+          <w:szCs w:val="24"/>
+        </w:rPr>
+        <w:t>view</w:t>
+      </w:r>
+      <w:proofErr w:type="spellEnd"/>
+      <w:r>
+        <w:rPr>
+          <w:sz w:val="24"/>
+          <w:szCs w:val="24"/>
+        </w:rPr>
+        <w:t>, è stato</w:t>
+      </w:r>
+      <w:r>
+        <w:rPr>
+          <w:sz w:val="24"/>
+          <w:szCs w:val="24"/>
+        </w:rPr>
+        <w:t>, come detto in precedenza,</w:t>
+      </w:r>
+      <w:r>
+        <w:rPr>
+          <w:sz w:val="24"/>
+          <w:szCs w:val="24"/>
+        </w:rPr>
+        <w:t xml:space="preserve"> eseguito a mano direttamente su </w:t>
+      </w:r>
+      <w:proofErr w:type="spellStart"/>
+      <w:r>
+        <w:rPr>
+          <w:sz w:val="24"/>
+          <w:szCs w:val="24"/>
+        </w:rPr>
+        <w:t>pgAdmin</w:t>
+      </w:r>
+      <w:proofErr w:type="spellEnd"/>
+      <w:r>
+        <w:rPr>
+          <w:sz w:val="24"/>
+          <w:szCs w:val="24"/>
         </w:rPr>
         <w:t xml:space="preserve"> </w:t>
       </w:r>
-      <w:r>
-        <w:rPr>
-          <w:b/>
-          <w:bCs/>
-        </w:rPr>
-        <w:t>,</w:t>
-      </w:r>
-      <w:proofErr w:type="gramEnd"/>
-    </w:p>
-    <w:p>
-      <w:pPr>
-        <w:pStyle w:val="Paragrafoelenco"/>
-        <w:numPr>
-          <w:ilvl w:val="0"/>
-          <w:numId w:val="15"/>
-        </w:numPr>
-        <w:rPr>
-          <w:b/>
-          <w:bCs/>
-        </w:rPr>
-      </w:pPr>
-      <w:r>
-        <w:rPr>
-          <w:b/>
-          <w:bCs/>
-        </w:rPr>
-        <w:t>VIEW EFFETTIVAMENTE TRASFERITE</w:t>
-      </w:r>
-      <w:r>
-        <w:rPr>
-          <w:b/>
-          <w:bCs/>
-        </w:rPr>
-        <w:t>.</w:t>
-      </w:r>
-    </w:p>
-    <w:p>
-      <w:pPr>
-        <w:pStyle w:val="Paragrafoelenco"/>
-        <w:rPr>
-          <w:b/>
-          <w:bCs/>
-        </w:rPr>
-      </w:pPr>
-    </w:p>
-    <w:p>
-      <w:pPr>
-        <w:rPr>
-          <w:b/>
-          <w:bCs/>
-          <w:sz w:val="24"/>
-          <w:szCs w:val="24"/>
-        </w:rPr>
-      </w:pPr>
-      <w:r>
-        <w:rPr>
-          <w:sz w:val="24"/>
-          <w:szCs w:val="24"/>
-        </w:rPr>
-        <w:t>Il p</w:t>
-      </w:r>
-      <w:r>
-        <w:rPr>
-          <w:sz w:val="24"/>
-          <w:szCs w:val="24"/>
-        </w:rPr>
-        <w:t>rocedimento</w:t>
-      </w:r>
-      <w:r>
-        <w:rPr>
-          <w:sz w:val="24"/>
-          <w:szCs w:val="24"/>
-        </w:rPr>
-        <w:t xml:space="preserve"> di aggiunta delle </w:t>
-      </w:r>
-      <w:proofErr w:type="spellStart"/>
-      <w:r>
-        <w:rPr>
-          <w:sz w:val="24"/>
-          <w:szCs w:val="24"/>
-        </w:rPr>
-        <w:t>view</w:t>
-      </w:r>
-      <w:proofErr w:type="spellEnd"/>
-      <w:r>
-        <w:rPr>
-          <w:sz w:val="24"/>
-          <w:szCs w:val="24"/>
-        </w:rPr>
-        <w:t xml:space="preserve"> in DB3, nel caso delle </w:t>
-      </w:r>
-      <w:proofErr w:type="spellStart"/>
-      <w:r>
-        <w:rPr>
-          <w:sz w:val="24"/>
-          <w:szCs w:val="24"/>
-        </w:rPr>
-        <w:t>view</w:t>
-      </w:r>
-      <w:proofErr w:type="spellEnd"/>
-      <w:r>
-        <w:rPr>
-          <w:sz w:val="24"/>
-          <w:szCs w:val="24"/>
-        </w:rPr>
-        <w:t>, è stato</w:t>
-      </w:r>
-      <w:r>
-        <w:rPr>
-          <w:sz w:val="24"/>
-          <w:szCs w:val="24"/>
-        </w:rPr>
-        <w:t xml:space="preserve"> eseguito a mano direttamente su </w:t>
-      </w:r>
-      <w:proofErr w:type="spellStart"/>
-      <w:r>
-        <w:rPr>
-          <w:sz w:val="24"/>
-          <w:szCs w:val="24"/>
-        </w:rPr>
-        <w:t>pgAdmin</w:t>
-      </w:r>
-      <w:proofErr w:type="spellEnd"/>
-      <w:r>
-        <w:rPr>
-          <w:sz w:val="24"/>
-          <w:szCs w:val="24"/>
-        </w:rPr>
-        <w:t xml:space="preserve"> perché molte </w:t>
-      </w:r>
-      <w:proofErr w:type="spellStart"/>
-      <w:r>
-        <w:rPr>
-          <w:sz w:val="24"/>
-          <w:szCs w:val="24"/>
-        </w:rPr>
-        <w:t>view</w:t>
-      </w:r>
-      <w:proofErr w:type="spellEnd"/>
-      <w:r>
-        <w:rPr>
-          <w:sz w:val="24"/>
-          <w:szCs w:val="24"/>
-        </w:rPr>
-        <w:t xml:space="preserve"> non erano trasferibili (33).</w:t>
-      </w:r>
-    </w:p>
-    <w:p>
-      <w:pPr>
-        <w:rPr>
-          <w:sz w:val="24"/>
-          <w:szCs w:val="24"/>
-        </w:rPr>
-      </w:pPr>
-      <w:r>
-        <w:rPr>
-          <w:sz w:val="24"/>
-          <w:szCs w:val="24"/>
-        </w:rPr>
-        <w:t xml:space="preserve"> </w:t>
-      </w:r>
-      <w:proofErr w:type="gramStart"/>
-      <w:r>
-        <w:rPr>
-          <w:sz w:val="24"/>
-          <w:szCs w:val="24"/>
-        </w:rPr>
-        <w:t>( in</w:t>
-      </w:r>
-      <w:proofErr w:type="gramEnd"/>
-      <w:r>
-        <w:rPr>
-          <w:sz w:val="24"/>
-          <w:szCs w:val="24"/>
-        </w:rPr>
-        <w:t xml:space="preserve"> questo caso in db3 non c’erano vie non presenti in db2 ma solo il contrario).</w:t>
-      </w:r>
-    </w:p>
-    <w:p/>
+    </w:p>
+    <w:p>
+      <w:bookmarkStart w:id="1" w:name="_GoBack"/>
+      <w:bookmarkEnd w:id="1"/>
+    </w:p>
     <w:p>
       <w:pPr>
         <w:pStyle w:val="Titolo1"/>
@@ -2966,7 +3169,6 @@
           <w:sz w:val="24"/>
           <w:szCs w:val="24"/>
         </w:rPr>
-        <w:lastRenderedPageBreak/>
         <w:t>Sono presenti potenziali criticità all’esportazione da PC Mac o da Server in remoto (AWS o OVH).</w:t>
       </w:r>
     </w:p>
@@ -3146,6 +3348,7 @@
         </w:numPr>
       </w:pPr>
       <w:r>
+        <w:lastRenderedPageBreak/>
         <w:t>Attività preliminari</w:t>
       </w:r>
     </w:p>
@@ -3686,14 +3889,7 @@
           <w:sz w:val="24"/>
           <w:szCs w:val="24"/>
         </w:rPr>
-        <w:t>].</w:t>
-      </w:r>
-      <w:r>
-        <w:rPr>
-          <w:sz w:val="24"/>
-          <w:szCs w:val="24"/>
-        </w:rPr>
-        <w:t>Le</w:t>
+        <w:t>].Le</w:t>
       </w:r>
       <w:proofErr w:type="gramEnd"/>
       <w:r>
@@ -4408,6 +4604,92 @@
     </w:lvl>
   </w:abstractNum>
   <w:abstractNum w:abstractNumId="6" w15:restartNumberingAfterBreak="0">
+    <w:nsid w:val="323A055F"/>
+    <w:multiLevelType w:val="hybridMultilevel"/>
+    <w:tmpl w:val="9ECA5AB2"/>
+    <w:lvl w:ilvl="0" w:tplc="0809000F">
+      <w:start w:val="1"/>
+      <w:numFmt w:val="decimal"/>
+      <w:lvlText w:val="%1."/>
+      <w:lvlJc w:val="left"/>
+      <w:pPr>
+        <w:ind w:left="720" w:hanging="360"/>
+      </w:pPr>
+    </w:lvl>
+    <w:lvl w:ilvl="1" w:tplc="08090019" w:tentative="1">
+      <w:start w:val="1"/>
+      <w:numFmt w:val="lowerLetter"/>
+      <w:lvlText w:val="%2."/>
+      <w:lvlJc w:val="left"/>
+      <w:pPr>
+        <w:ind w:left="1440" w:hanging="360"/>
+      </w:pPr>
+    </w:lvl>
+    <w:lvl w:ilvl="2" w:tplc="0809001B" w:tentative="1">
+      <w:start w:val="1"/>
+      <w:numFmt w:val="lowerRoman"/>
+      <w:lvlText w:val="%3."/>
+      <w:lvlJc w:val="right"/>
+      <w:pPr>
+        <w:ind w:left="2160" w:hanging="180"/>
+      </w:pPr>
+    </w:lvl>
+    <w:lvl w:ilvl="3" w:tplc="0809000F" w:tentative="1">
+      <w:start w:val="1"/>
+      <w:numFmt w:val="decimal"/>
+      <w:lvlText w:val="%4."/>
+      <w:lvlJc w:val="left"/>
+      <w:pPr>
+        <w:ind w:left="2880" w:hanging="360"/>
+      </w:pPr>
+    </w:lvl>
+    <w:lvl w:ilvl="4" w:tplc="08090019" w:tentative="1">
+      <w:start w:val="1"/>
+      <w:numFmt w:val="lowerLetter"/>
+      <w:lvlText w:val="%5."/>
+      <w:lvlJc w:val="left"/>
+      <w:pPr>
+        <w:ind w:left="3600" w:hanging="360"/>
+      </w:pPr>
+    </w:lvl>
+    <w:lvl w:ilvl="5" w:tplc="0809001B" w:tentative="1">
+      <w:start w:val="1"/>
+      <w:numFmt w:val="lowerRoman"/>
+      <w:lvlText w:val="%6."/>
+      <w:lvlJc w:val="right"/>
+      <w:pPr>
+        <w:ind w:left="4320" w:hanging="180"/>
+      </w:pPr>
+    </w:lvl>
+    <w:lvl w:ilvl="6" w:tplc="0809000F" w:tentative="1">
+      <w:start w:val="1"/>
+      <w:numFmt w:val="decimal"/>
+      <w:lvlText w:val="%7."/>
+      <w:lvlJc w:val="left"/>
+      <w:pPr>
+        <w:ind w:left="5040" w:hanging="360"/>
+      </w:pPr>
+    </w:lvl>
+    <w:lvl w:ilvl="7" w:tplc="08090019" w:tentative="1">
+      <w:start w:val="1"/>
+      <w:numFmt w:val="lowerLetter"/>
+      <w:lvlText w:val="%8."/>
+      <w:lvlJc w:val="left"/>
+      <w:pPr>
+        <w:ind w:left="5760" w:hanging="360"/>
+      </w:pPr>
+    </w:lvl>
+    <w:lvl w:ilvl="8" w:tplc="0809001B" w:tentative="1">
+      <w:start w:val="1"/>
+      <w:numFmt w:val="lowerRoman"/>
+      <w:lvlText w:val="%9."/>
+      <w:lvlJc w:val="right"/>
+      <w:pPr>
+        <w:ind w:left="6480" w:hanging="180"/>
+      </w:pPr>
+    </w:lvl>
+  </w:abstractNum>
+  <w:abstractNum w:abstractNumId="7" w15:restartNumberingAfterBreak="0">
     <w:nsid w:val="3BE90EE2"/>
     <w:multiLevelType w:val="multilevel"/>
     <w:tmpl w:val="0410001D"/>
@@ -4493,7 +4775,7 @@
       </w:pPr>
     </w:lvl>
   </w:abstractNum>
-  <w:abstractNum w:abstractNumId="7" w15:restartNumberingAfterBreak="0">
+  <w:abstractNum w:abstractNumId="8" w15:restartNumberingAfterBreak="0">
     <w:nsid w:val="433F031C"/>
     <w:multiLevelType w:val="hybridMultilevel"/>
     <w:tmpl w:val="BF20E17C"/>
@@ -4582,7 +4864,7 @@
       </w:pPr>
     </w:lvl>
   </w:abstractNum>
-  <w:abstractNum w:abstractNumId="8" w15:restartNumberingAfterBreak="0">
+  <w:abstractNum w:abstractNumId="9" w15:restartNumberingAfterBreak="0">
     <w:nsid w:val="4C7D1DED"/>
     <w:multiLevelType w:val="hybridMultilevel"/>
     <w:tmpl w:val="EA160F56"/>
@@ -4668,7 +4950,7 @@
       </w:pPr>
     </w:lvl>
   </w:abstractNum>
-  <w:abstractNum w:abstractNumId="9" w15:restartNumberingAfterBreak="0">
+  <w:abstractNum w:abstractNumId="10" w15:restartNumberingAfterBreak="0">
     <w:nsid w:val="50FA547B"/>
     <w:multiLevelType w:val="hybridMultilevel"/>
     <w:tmpl w:val="58D42BAC"/>
@@ -4781,7 +5063,7 @@
       </w:rPr>
     </w:lvl>
   </w:abstractNum>
-  <w:abstractNum w:abstractNumId="10" w15:restartNumberingAfterBreak="0">
+  <w:abstractNum w:abstractNumId="11" w15:restartNumberingAfterBreak="0">
     <w:nsid w:val="529F546E"/>
     <w:multiLevelType w:val="multilevel"/>
     <w:tmpl w:val="4DE01D96"/>
@@ -4867,7 +5149,7 @@
       </w:pPr>
     </w:lvl>
   </w:abstractNum>
-  <w:abstractNum w:abstractNumId="11" w15:restartNumberingAfterBreak="0">
+  <w:abstractNum w:abstractNumId="12" w15:restartNumberingAfterBreak="0">
     <w:nsid w:val="645557FE"/>
     <w:multiLevelType w:val="hybridMultilevel"/>
     <w:tmpl w:val="E6D87776"/>
@@ -4953,7 +5235,7 @@
       </w:pPr>
     </w:lvl>
   </w:abstractNum>
-  <w:abstractNum w:abstractNumId="12" w15:restartNumberingAfterBreak="0">
+  <w:abstractNum w:abstractNumId="13" w15:restartNumberingAfterBreak="0">
     <w:nsid w:val="69CB694F"/>
     <w:multiLevelType w:val="hybridMultilevel"/>
     <w:tmpl w:val="48624CE6"/>
@@ -5042,7 +5324,7 @@
       </w:pPr>
     </w:lvl>
   </w:abstractNum>
-  <w:abstractNum w:abstractNumId="13" w15:restartNumberingAfterBreak="0">
+  <w:abstractNum w:abstractNumId="14" w15:restartNumberingAfterBreak="0">
     <w:nsid w:val="761C520F"/>
     <w:multiLevelType w:val="hybridMultilevel"/>
     <w:tmpl w:val="7B804DAC"/>
@@ -5128,7 +5410,7 @@
       </w:pPr>
     </w:lvl>
   </w:abstractNum>
-  <w:abstractNum w:abstractNumId="14" w15:restartNumberingAfterBreak="0">
+  <w:abstractNum w:abstractNumId="15" w15:restartNumberingAfterBreak="0">
     <w:nsid w:val="773F6BBB"/>
     <w:multiLevelType w:val="hybridMultilevel"/>
     <w:tmpl w:val="ABCAFBE6"/>
@@ -5244,46 +5526,49 @@
     <w:abstractNumId w:val="1"/>
   </w:num>
   <w:num w:numId="2">
-    <w:abstractNumId w:val="10"/>
+    <w:abstractNumId w:val="11"/>
   </w:num>
   <w:num w:numId="3">
     <w:abstractNumId w:val="5"/>
   </w:num>
   <w:num w:numId="4">
-    <w:abstractNumId w:val="9"/>
+    <w:abstractNumId w:val="10"/>
   </w:num>
   <w:num w:numId="5">
     <w:abstractNumId w:val="2"/>
   </w:num>
   <w:num w:numId="6">
-    <w:abstractNumId w:val="7"/>
+    <w:abstractNumId w:val="8"/>
   </w:num>
   <w:num w:numId="7">
     <w:abstractNumId w:val="3"/>
   </w:num>
   <w:num w:numId="8">
-    <w:abstractNumId w:val="13"/>
+    <w:abstractNumId w:val="14"/>
   </w:num>
   <w:num w:numId="9">
-    <w:abstractNumId w:val="6"/>
+    <w:abstractNumId w:val="7"/>
   </w:num>
   <w:num w:numId="10">
     <w:abstractNumId w:val="0"/>
   </w:num>
   <w:num w:numId="11">
-    <w:abstractNumId w:val="11"/>
+    <w:abstractNumId w:val="12"/>
   </w:num>
   <w:num w:numId="12">
-    <w:abstractNumId w:val="8"/>
+    <w:abstractNumId w:val="9"/>
   </w:num>
   <w:num w:numId="13">
-    <w:abstractNumId w:val="12"/>
+    <w:abstractNumId w:val="13"/>
   </w:num>
   <w:num w:numId="14">
-    <w:abstractNumId w:val="14"/>
+    <w:abstractNumId w:val="15"/>
   </w:num>
   <w:num w:numId="15">
     <w:abstractNumId w:val="4"/>
+  </w:num>
+  <w:num w:numId="16">
+    <w:abstractNumId w:val="6"/>
   </w:num>
 </w:numbering>
 </file>
@@ -5708,6 +5993,7 @@
   <w:style w:type="character" w:default="1" w:styleId="Carpredefinitoparagrafo">
     <w:name w:val="Default Paragraph Font"/>
     <w:uiPriority w:val="1"/>
+    <w:semiHidden/>
     <w:unhideWhenUsed/>
   </w:style>
   <w:style w:type="table" w:default="1" w:styleId="Tabellanormale">

</xml_diff>